<commit_message>
doc: apply 25 Paper v2 corrections via python-docx script
Automated corrections applied:
- Abstract: fixed latency (0.003ms/0.005ms), added zero false negatives
- Typosquatting detection: 95% -> 100% (para 113, 164)
- Performance metrics: corrected latency/throughput values (para 137)
- Conclusions: 0.19ms -> 0.005ms, 33,000x -> 35x, Argon2id -> PBKDF2 (para 166)
- Table 0 (Confusion Matrix): 99.1% -> 100% accuracy, 71->72 prevented
- Table 2 (Feature Comparison): 95% -> 100% typosquatting, Zero-knowledge Yes -> Partial
- Table 3 (Performance Metrics): complete update with measured values

Remaining 18 structural corrections require manual Word editing (new sections, tables, figures, references).

Part of SDD change cybervault-100-completion (Track B).
</commit_message>
<xml_diff>
--- a/paper-v2-corrected.docx
+++ b/paper-v2-corrected.docx
@@ -493,7 +493,7 @@
           <w:bCs/>
           <w:lang w:val="es-EC"/>
         </w:rPr>
-        <w:t>Abstract</w:t>
+        <w:t>Abstract. Digital technologies have become deeply embedded in everyday life, significantly increasing users' exposure to cyber threats, particularly phishing attacks. These attacks exploit human behavior rather than system vulnerabilities, making them highly effective despite advancements in detection techniques. This paper presents a phishing-aware password manager that introduces a preventive domain validation mechanism before credential submission. Unlike traditional approaches that rely on post-detection methods such as machine learning or URL classification, the proposed system enforces a user-centric trust model in which credentials are strictly bound to domains explicitly defined by the user. The architecture integrates a browser extension, a backend service, and a hybrid secure storage model combining local encryption with protected remote synchronization. The validation mechanism incorporates exact domain matching, similarity analysis, and detection of typosquatting and homograph attacks. Experimental evaluation demonstrates a detection rate of 100.00% for synthetic attacks and 100% for real-world phishing patterns, with zero false positives and zero false negatives and average latency of 0.003ms for exact-match and 0.005ms for similarity analysis across 75 test scenarios (Node.js v24.18.0, linux x64). The results show that pre-submission validation effectively prevents credential exposure at the critical point of interaction, significantly reducing the success rate of phishing attacks.</w:t>
       </w:r>
       <w:proofErr w:type="spellEnd"/>
       <w:r>
@@ -502,27 +502,16 @@
           <w:bCs/>
           <w:lang w:val="es-EC"/>
         </w:rPr>
-        <w:t xml:space="preserve">. </w:t>
-      </w:r>
-      <w:r>
-        <w:t xml:space="preserve">Digital technologies have become deeply embedded in everyday life, significantly increasing users' exposure to cyber threats, particularly phishing attacks. These attacks exploit human behavior rather than system vulnerabilities, making them highly effective despite advancements in detection techniques. This paper presents a phishing-aware password manager that introduces a preventive domain validation mechanism before credential submission. Unlike traditional approaches that rely on post-detection methods such as machine learning or URL classification, the proposed system enforces a user-centric trust model in which credentials are strictly bound to domains explicitly defined by the user. The architecture integrates a browser extension, a backend service, and a hybrid secure storage model combining local encryption with protected remote synchronization. The validation mechanism incorporates exact domain matching, similarity analysis, and detection of </w:t>
-      </w:r>
+      </w:r>
+      <w:r/>
       <w:proofErr w:type="spellStart"/>
-      <w:r>
-        <w:t>typosquatting</w:t>
-      </w:r>
+      <w:r/>
       <w:proofErr w:type="spellEnd"/>
-      <w:r>
-        <w:t xml:space="preserve"> and homograph attacks. Experimental evaluation demonstrates a detection rate of 100.00% for synthetic attacks and 100% for real-world phishing patterns, with zero false positives and negligible latency (&lt;0.19 </w:t>
-      </w:r>
+      <w:r/>
       <w:proofErr w:type="spellStart"/>
-      <w:r>
-        <w:t>ms</w:t>
-      </w:r>
+      <w:r/>
       <w:proofErr w:type="spellEnd"/>
-      <w:r>
-        <w:t>). The results show that pre-submission validation effectively prevents credential exposure at the critical point of interaction, significantly reducing the success rate of phishing attacks.</w:t>
-      </w:r>
+      <w:r/>
     </w:p>
     <w:p>
       <w:pPr>
@@ -3222,7 +3211,9 @@
                 <w:sz w:val="18"/>
                 <w:szCs w:val="18"/>
               </w:rPr>
-              <w:t>1</w:t>
+            </w:r>
+            <w:r>
+              <w:t>0</w:t>
             </w:r>
           </w:p>
         </w:tc>
@@ -3245,7 +3236,9 @@
                 <w:sz w:val="18"/>
                 <w:szCs w:val="18"/>
               </w:rPr>
-              <w:t>71</w:t>
+            </w:r>
+            <w:r>
+              <w:t>72</w:t>
             </w:r>
           </w:p>
         </w:tc>
@@ -3305,38 +3298,39 @@
                 <w:sz w:val="18"/>
                 <w:szCs w:val="18"/>
               </w:rPr>
-              <w:t xml:space="preserve">Overall </w:t>
-            </w:r>
-            <w:r>
-              <w:rPr>
-                <w:sz w:val="18"/>
-                <w:szCs w:val="18"/>
-              </w:rPr>
-              <w:t>Accuracy: 99.1%</w:t>
-            </w:r>
-            <w:r>
-              <w:rPr>
-                <w:sz w:val="18"/>
-                <w:szCs w:val="18"/>
-              </w:rPr>
+            </w:r>
+            <w:r>
+              <w:rPr>
+                <w:sz w:val="18"/>
+                <w:szCs w:val="18"/>
+              </w:rPr>
+            </w:r>
+            <w:r>
+              <w:rPr>
+                <w:sz w:val="18"/>
+                <w:szCs w:val="18"/>
+              </w:rPr>
+            </w:r>
+            <w:r>
+              <w:rPr>
+                <w:sz w:val="18"/>
+                <w:szCs w:val="18"/>
+              </w:rPr>
+            </w:r>
+            <w:r>
+              <w:rPr>
+                <w:sz w:val="18"/>
+                <w:szCs w:val="18"/>
+              </w:rPr>
+            </w:r>
+            <w:r>
+              <w:t>Overall Accuracy: 100%</w:t>
               <w:br/>
               <w:t>Precision: 100.0%</w:t>
-            </w:r>
-            <w:r>
-              <w:rPr>
-                <w:sz w:val="18"/>
-                <w:szCs w:val="18"/>
-              </w:rPr>
               <w:br/>
-              <w:t>Recall: 98.6%</w:t>
-            </w:r>
-            <w:r>
-              <w:rPr>
-                <w:sz w:val="18"/>
-                <w:szCs w:val="18"/>
-              </w:rPr>
+              <w:t>Recall: 100%</w:t>
               <w:br/>
-              <w:t>F1-Score: 99.3%</w:t>
+              <w:t>F1-Score: 100%</w:t>
             </w:r>
           </w:p>
         </w:tc>
@@ -3399,37 +3393,26 @@
     <w:p/>
     <w:p>
       <w:r>
-        <w:lastRenderedPageBreak/>
-        <w:t xml:space="preserve">The system detected </w:t>
+        <w:t>The system detected 100% (20/20) of typosquatting variants, with an average similarity score of 89.60%. Variants involving duplication, omission, and substitution were consistently flagged. No false negatives were observed across all evaluated scenarios, consistent with DNS standards.</w:t>
       </w:r>
       <w:r>
         <w:rPr>
           <w:b/>
           <w:bCs/>
         </w:rPr>
-        <w:t>95.00% (19/20)</w:t>
-      </w:r>
-      <w:r>
-        <w:t xml:space="preserve"> of </w:t>
-      </w:r>
+      </w:r>
+      <w:r/>
       <w:proofErr w:type="spellStart"/>
-      <w:r>
-        <w:t>typosquatting</w:t>
-      </w:r>
+      <w:r/>
       <w:proofErr w:type="spellEnd"/>
-      <w:r>
-        <w:t xml:space="preserve"> variants, with an average similarity score of </w:t>
-      </w:r>
+      <w:r/>
       <w:r>
         <w:rPr>
           <w:b/>
           <w:bCs/>
         </w:rPr>
-        <w:t>89.60%</w:t>
-      </w:r>
-      <w:r>
-        <w:t>. Variants involving duplication, omission, and substitution were consistently flagged. No false negatives were observed across all evaluated scenarios, consistent with DNS standards.</w:t>
-      </w:r>
+      </w:r>
+      <w:r/>
     </w:p>
     <w:p/>
     <w:p>
@@ -4861,7 +4844,9 @@
                 <w:sz w:val="18"/>
                 <w:szCs w:val="18"/>
               </w:rPr>
-              <w:t>Yes (95%)</w:t>
+            </w:r>
+            <w:r>
+              <w:t>Yes (100%)</w:t>
             </w:r>
           </w:p>
         </w:tc>
@@ -5325,7 +5310,9 @@
                 <w:sz w:val="18"/>
                 <w:szCs w:val="18"/>
               </w:rPr>
-              <w:t>Yes</w:t>
+            </w:r>
+            <w:r>
+              <w:t>Partial</w:t>
             </w:r>
           </w:p>
         </w:tc>
@@ -5796,33 +5783,19 @@
         <w:ind w:firstLine="0"/>
       </w:pPr>
       <w:r>
-        <w:t xml:space="preserve">Key results: exact-match latency &lt;0.001 </w:t>
+        <w:t>Key results: exact-match latency 0.0030ms, similarity latency 0.0054ms, exact-match throughput 328,103/s, similarity throughput 185,688/s. The pipeline orchestrator adds measurable overhead compared to raw algorithm benchmarks.</w:t>
       </w:r>
       <w:proofErr w:type="spellStart"/>
-      <w:r>
-        <w:t>ms</w:t>
-      </w:r>
+      <w:r/>
       <w:proofErr w:type="spellEnd"/>
-      <w:r>
-        <w:t>, similarity</w:t>
-      </w:r>
-      <w:r>
-        <w:t xml:space="preserve"> </w:t>
-      </w:r>
-      <w:r>
-        <w:t xml:space="preserve">similarity latency 0.005 </w:t>
-      </w:r>
+      <w:r/>
+      <w:r/>
+      <w:r/>
       <w:proofErr w:type="spellStart"/>
-      <w:r>
-        <w:t>ms</w:t>
-      </w:r>
+      <w:r/>
       <w:proofErr w:type="spellEnd"/>
-      <w:r>
-        <w:t xml:space="preserve">, and </w:t>
-      </w:r>
-      <w:r>
-        <w:t>isolated microbenchmark throughput of 328,103 exact-match comparisons per second. Under the evaluated conditions, the validation process operated approximately 33,000× faster than the typical credential-submission interaction window.</w:t>
-      </w:r>
+      <w:r/>
+      <w:r/>
     </w:p>
     <w:p>
       <w:pPr>
@@ -6049,7 +6022,6 @@
                 <w:sz w:val="18"/>
                 <w:szCs w:val="18"/>
               </w:rPr>
-              <w:t xml:space="preserve">&lt; 0.001 </w:t>
             </w:r>
             <w:proofErr w:type="spellStart"/>
             <w:r>
@@ -6057,9 +6029,11 @@
                 <w:sz w:val="18"/>
                 <w:szCs w:val="18"/>
               </w:rPr>
-              <w:t>ms</w:t>
             </w:r>
             <w:proofErr w:type="spellEnd"/>
+            <w:r>
+              <w:t>0.0030 ms</w:t>
+            </w:r>
           </w:p>
         </w:tc>
         <w:tc>
@@ -6086,7 +6060,6 @@
                 <w:sz w:val="18"/>
                 <w:szCs w:val="18"/>
               </w:rPr>
-              <w:t xml:space="preserve">&lt; 1 </w:t>
             </w:r>
             <w:proofErr w:type="spellStart"/>
             <w:r>
@@ -6094,9 +6067,11 @@
                 <w:sz w:val="18"/>
                 <w:szCs w:val="18"/>
               </w:rPr>
-              <w:t>ms</w:t>
             </w:r>
             <w:proofErr w:type="spellEnd"/>
+            <w:r>
+              <w:t>&lt; 1 ms</w:t>
+            </w:r>
           </w:p>
         </w:tc>
       </w:tr>
@@ -6161,21 +6136,21 @@
                 <w:sz w:val="18"/>
                 <w:szCs w:val="18"/>
               </w:rPr>
-              <w:t xml:space="preserve">22,177,080 </w:t>
-            </w:r>
-            <w:r>
-              <w:rPr>
-                <w:sz w:val="18"/>
-                <w:szCs w:val="18"/>
-              </w:rPr>
-              <w:t>comparisons</w:t>
-            </w:r>
-            <w:r>
-              <w:rPr>
-                <w:sz w:val="18"/>
-                <w:szCs w:val="18"/>
-              </w:rPr>
-              <w:t>/s</w:t>
+            </w:r>
+            <w:r>
+              <w:rPr>
+                <w:sz w:val="18"/>
+                <w:szCs w:val="18"/>
+              </w:rPr>
+            </w:r>
+            <w:r>
+              <w:rPr>
+                <w:sz w:val="18"/>
+                <w:szCs w:val="18"/>
+              </w:rPr>
+            </w:r>
+            <w:r>
+              <w:t>328,103/s</w:t>
             </w:r>
           </w:p>
         </w:tc>
@@ -6203,7 +6178,6 @@
                 <w:sz w:val="18"/>
                 <w:szCs w:val="18"/>
               </w:rPr>
-              <w:t xml:space="preserve">&gt; 1M </w:t>
             </w:r>
             <w:proofErr w:type="spellStart"/>
             <w:r>
@@ -6211,7 +6185,6 @@
                 <w:sz w:val="18"/>
                 <w:szCs w:val="18"/>
               </w:rPr>
-              <w:t>val</w:t>
             </w:r>
             <w:proofErr w:type="spellEnd"/>
             <w:r>
@@ -6219,7 +6192,9 @@
                 <w:sz w:val="18"/>
                 <w:szCs w:val="18"/>
               </w:rPr>
-              <w:t>/s</w:t>
+            </w:r>
+            <w:r>
+              <w:t>&gt; 1M val/s</w:t>
             </w:r>
           </w:p>
         </w:tc>
@@ -6285,7 +6260,6 @@
                 <w:sz w:val="18"/>
                 <w:szCs w:val="18"/>
               </w:rPr>
-              <w:t xml:space="preserve">0.19 </w:t>
             </w:r>
             <w:proofErr w:type="spellStart"/>
             <w:r>
@@ -6293,7 +6267,6 @@
                 <w:sz w:val="18"/>
                 <w:szCs w:val="18"/>
               </w:rPr>
-              <w:t>ms</w:t>
             </w:r>
             <w:proofErr w:type="spellEnd"/>
             <w:r>
@@ -6301,21 +6274,21 @@
                 <w:sz w:val="18"/>
                 <w:szCs w:val="18"/>
               </w:rPr>
-              <w:t xml:space="preserve"> (</w:t>
-            </w:r>
-            <w:r>
-              <w:rPr>
-                <w:sz w:val="18"/>
-                <w:szCs w:val="18"/>
-              </w:rPr>
-              <w:t>σ = 0.02</w:t>
-            </w:r>
-            <w:r>
-              <w:rPr>
-                <w:sz w:val="18"/>
-                <w:szCs w:val="18"/>
-              </w:rPr>
-              <w:t>)</w:t>
+            </w:r>
+            <w:r>
+              <w:rPr>
+                <w:sz w:val="18"/>
+                <w:szCs w:val="18"/>
+              </w:rPr>
+            </w:r>
+            <w:r>
+              <w:rPr>
+                <w:sz w:val="18"/>
+                <w:szCs w:val="18"/>
+              </w:rPr>
+            </w:r>
+            <w:r>
+              <w:t>0.0054 ms</w:t>
             </w:r>
           </w:p>
         </w:tc>
@@ -6343,7 +6316,6 @@
                 <w:sz w:val="18"/>
                 <w:szCs w:val="18"/>
               </w:rPr>
-              <w:t xml:space="preserve">&lt; 1 </w:t>
             </w:r>
             <w:proofErr w:type="spellStart"/>
             <w:r>
@@ -6351,9 +6323,11 @@
                 <w:sz w:val="18"/>
                 <w:szCs w:val="18"/>
               </w:rPr>
-              <w:t>ms</w:t>
             </w:r>
             <w:proofErr w:type="spellEnd"/>
+            <w:r>
+              <w:t>&lt; 1 ms</w:t>
+            </w:r>
           </w:p>
         </w:tc>
       </w:tr>
@@ -6425,21 +6399,21 @@
                 <w:sz w:val="18"/>
                 <w:szCs w:val="18"/>
               </w:rPr>
-              <w:t xml:space="preserve">5,242 </w:t>
-            </w:r>
-            <w:r>
-              <w:rPr>
-                <w:sz w:val="18"/>
-                <w:szCs w:val="18"/>
-              </w:rPr>
-              <w:t>comparisons</w:t>
-            </w:r>
-            <w:r>
-              <w:rPr>
-                <w:sz w:val="18"/>
-                <w:szCs w:val="18"/>
-              </w:rPr>
-              <w:t>/s</w:t>
+            </w:r>
+            <w:r>
+              <w:rPr>
+                <w:sz w:val="18"/>
+                <w:szCs w:val="18"/>
+              </w:rPr>
+            </w:r>
+            <w:r>
+              <w:rPr>
+                <w:sz w:val="18"/>
+                <w:szCs w:val="18"/>
+              </w:rPr>
+            </w:r>
+            <w:r>
+              <w:t>185,688/s</w:t>
             </w:r>
           </w:p>
         </w:tc>
@@ -6467,7 +6441,6 @@
                 <w:sz w:val="18"/>
                 <w:szCs w:val="18"/>
               </w:rPr>
-              <w:t xml:space="preserve">&gt; 1K </w:t>
             </w:r>
             <w:proofErr w:type="spellStart"/>
             <w:r>
@@ -6475,7 +6448,6 @@
                 <w:sz w:val="18"/>
                 <w:szCs w:val="18"/>
               </w:rPr>
-              <w:t>val</w:t>
             </w:r>
             <w:proofErr w:type="spellEnd"/>
             <w:r>
@@ -6483,7 +6455,9 @@
                 <w:sz w:val="18"/>
                 <w:szCs w:val="18"/>
               </w:rPr>
-              <w:t>/s</w:t>
+            </w:r>
+            <w:r>
+              <w:t>&gt; 1K val/s</w:t>
             </w:r>
           </w:p>
         </w:tc>
@@ -6547,6 +6521,8 @@
                 <w:sz w:val="18"/>
                 <w:szCs w:val="18"/>
               </w:rPr>
+            </w:r>
+            <w:r>
               <w:t>Non-blocking (software-based)</w:t>
             </w:r>
           </w:p>
@@ -6574,6 +6550,8 @@
                 <w:sz w:val="18"/>
                 <w:szCs w:val="18"/>
               </w:rPr>
+            </w:r>
+            <w:r>
               <w:t>Non-blocking</w:t>
             </w:r>
           </w:p>
@@ -6628,6 +6606,8 @@
                 <w:sz w:val="18"/>
                 <w:szCs w:val="18"/>
               </w:rPr>
+            </w:r>
+            <w:r>
               <w:t>&lt; 50 MB</w:t>
             </w:r>
           </w:p>
@@ -6650,6 +6630,8 @@
                 <w:sz w:val="18"/>
                 <w:szCs w:val="18"/>
               </w:rPr>
+            </w:r>
+            <w:r>
               <w:t>&lt; 100 MB</w:t>
             </w:r>
           </w:p>
@@ -7019,102 +7001,47 @@
     </w:p>
     <w:p>
       <w:r>
-        <w:t xml:space="preserve">The experimental results validate the effectiveness of the proposed approach. The system achieved a 100% detection rate (95% CI: [92.6%, 100.0%]) against synthetic </w:t>
+        <w:t>The experimental results validate the effectiveness of the proposed approach. The system achieved a 100% detection rate (95% CI: [92.6%, 100.0%]) against synthetic typosquatting and homograph attacks, and 100.00% detection (95% CI: [89.4%, 100.0%]) across real-world phishing domain patterns [11], [12], [13], [15]. Detection performance remained consistent across attack categories, including 100% for typosquatting variants and 100.00% for homograph and real-world phishing scenarios, while maintaining a 0.00% false positive rate on legitimate domains.</w:t>
       </w:r>
       <w:proofErr w:type="spellStart"/>
-      <w:r>
-        <w:t>typosquatting</w:t>
-      </w:r>
+      <w:r/>
       <w:proofErr w:type="spellEnd"/>
-      <w:r>
-        <w:t xml:space="preserve"> and homograph attacks, and 100.00% detection (95% CI: [89.4%, 100.0%]) across real-world phishing domain patterns [</w:t>
-      </w:r>
-      <w:r>
-        <w:t>11</w:t>
-      </w:r>
-      <w:r>
-        <w:t>], [</w:t>
-      </w:r>
-      <w:r>
-        <w:t>12</w:t>
-      </w:r>
-      <w:r>
-        <w:t>], [</w:t>
-      </w:r>
-      <w:r>
-        <w:t>13</w:t>
-      </w:r>
-      <w:r>
-        <w:t>], [1</w:t>
-      </w:r>
-      <w:r>
-        <w:t>5</w:t>
-      </w:r>
-      <w:r>
-        <w:t xml:space="preserve">]. Detection performance remained consistent across attack categories, including 95.00% for </w:t>
-      </w:r>
+      <w:r/>
+      <w:r/>
+      <w:r/>
+      <w:r/>
+      <w:r/>
+      <w:r/>
+      <w:r/>
+      <w:r/>
+      <w:r/>
       <w:proofErr w:type="spellStart"/>
-      <w:r>
-        <w:t>typosquatting</w:t>
-      </w:r>
+      <w:r/>
       <w:proofErr w:type="spellEnd"/>
-      <w:r>
-        <w:t xml:space="preserve"> variants and 100.00% for homograph and real-world phishing scenarios, while maintaining a 0.00% false positive rate on legitimate domains.</w:t>
-      </w:r>
+      <w:r/>
     </w:p>
     <w:p/>
     <w:p>
       <w:r>
-        <w:t xml:space="preserve">The three-phase domain validation mechanism combining exact-match lookup, Unicode confusable detection, and similarity analysis enabled real-time protection with an average latency of &lt;0.19 </w:t>
+        <w:t>The three-phase domain validation mechanism combining exact-match lookup, Unicode confusable detection, and similarity analysis enabled real-time protection with an average latency of 0.005ms, allowing intervention approximately 35× faster than the typical user credential submission window [11], [12], [16]. Additionally, the hybrid secure storage model, based on AES-256-GCM encryption and PBKDF2 with 600,000 iterations key derivation, ensured strong confidentiality guarantees, while the password generator achieved an average entropy of 176.56 bits, exceeding standard cryptographic thresholds [3], [25], [29].</w:t>
       </w:r>
       <w:proofErr w:type="spellStart"/>
-      <w:r>
-        <w:t>ms</w:t>
-      </w:r>
+      <w:r/>
       <w:proofErr w:type="spellEnd"/>
-      <w:r>
-        <w:t>, allowing intervention approximately 33,000× faster than the typical user credential submission window [</w:t>
-      </w:r>
-      <w:r>
-        <w:t>11</w:t>
-      </w:r>
-      <w:r>
-        <w:t>], [</w:t>
-      </w:r>
-      <w:r>
-        <w:t>12</w:t>
-      </w:r>
-      <w:r>
-        <w:t>], [1</w:t>
-      </w:r>
-      <w:r>
-        <w:t>6</w:t>
-      </w:r>
-      <w:r>
-        <w:t xml:space="preserve">]. Additionally, the hybrid secure storage model, based on AES-256-GCM encryption and Argon2id key </w:t>
-      </w:r>
-      <w:r>
-        <w:lastRenderedPageBreak/>
-        <w:t>derivation, ensured strong confidentiality guarantees, while the password generator achieved an average entropy of 176.56 bits, exceeding standard cryptographic thresholds [</w:t>
-      </w:r>
-      <w:r>
-        <w:t>3</w:t>
-      </w:r>
-      <w:r>
-        <w:t>], [2</w:t>
-      </w:r>
-      <w:r>
-        <w:t>5</w:t>
-      </w:r>
-      <w:r>
-        <w:t>], [2</w:t>
-      </w:r>
-      <w:r>
-        <w:t>9</w:t>
-      </w:r>
-      <w:r>
-        <w:t>].</w:t>
-      </w:r>
+      <w:r/>
+      <w:r/>
+      <w:r/>
+      <w:r/>
+      <w:r/>
+      <w:r/>
+      <w:r/>
+      <w:r/>
+      <w:r/>
+      <w:r/>
+      <w:r/>
+      <w:r/>
+      <w:r/>
+      <w:r/>
     </w:p>
     <w:p/>
     <w:p>

</xml_diff>